<commit_message>
1John: full meaning audit 2026-09-23 — 8 units (EN 3, KO titles 5), gates 1-8 PASS, 0 split candidates
</commit_message>
<xml_diff>
--- a/gdocs_build/1John.docx
+++ b/gdocs_build/1John.docx
@@ -885,7 +885,7 @@
               <w:rPr>
                 <w:sz w:val="18"/>
               </w:rPr>
-              <w:t>My dear friends, nothing here is new. This is the oldest commandment in the book, and you've known it from day one. It's always been part of the message you heard. On the other hand, it is new in a fresh way — because of what Christ is doing in you: the darkness is fading, and the true light is already shining bright.</w:t>
+              <w:t>My dear friends, nothing here is new. This is the oldest commandment in the book, and you've known it from day one. It's always been part of the message you heard. On the other hand, it is new in a fresh way — freshly minted in both Christ and in you: the darkness is fading, and the true light is already shining bright.</w:t>
             </w:r>
           </w:p>
         </w:tc>
@@ -1960,7 +1960,7 @@
         <w:pStyle w:val="Heading1"/>
       </w:pPr>
       <w:r>
-        <w:t>Chapter 3 — honored ones in God's Squad</w:t>
+        <w:t>Chapter 3 — Honored Ones in God's Squad</w:t>
       </w:r>
     </w:p>
     <w:tbl>
@@ -2632,7 +2632,7 @@
               <w:rPr>
                 <w:sz w:val="18"/>
               </w:rPr>
-              <w:t>This is how we've come to understand love: Christ gave up his life for us. That's why we should be willing to give sacrificially for our fellow believers — not just look out for ourselves. If you see a brother or sister in need and you have the means to help, but you ignore them and do nothing — what happens to God's love? It disappears. And you made it disappear.</w:t>
+              <w:t>This is how we've come to understand and experience love: Christ gave up his life for us. That's why we should be willing to give sacrificially for our fellow believers — not just look out for ourselves. If you see a brother or sister in need and you have the means to help, but you ignore them and do nothing — what happens to God's love? It disappears. And you made it disappear.</w:t>
             </w:r>
           </w:p>
         </w:tc>

</xml_diff>

<commit_message>
배지 전수조사 docx 재생성분 정리 (1John/3John/Revelation/1Peter/2Peter/Hebrews/Matthew 등)
</commit_message>
<xml_diff>
--- a/gdocs_build/1John.docx
+++ b/gdocs_build/1John.docx
@@ -676,7 +676,7 @@
                 <w:b/>
                 <w:sz w:val="16"/>
               </w:rPr>
-              <w:t>2-3</w:t>
+              <w:t>3</w:t>
             </w:r>
           </w:p>
           <w:p>
@@ -699,7 +699,7 @@
                 <w:b/>
                 <w:sz w:val="16"/>
               </w:rPr>
-              <w:t>2-3</w:t>
+              <w:t>3</w:t>
             </w:r>
           </w:p>
           <w:p>
@@ -722,7 +722,7 @@
                 <w:b/>
                 <w:sz w:val="16"/>
               </w:rPr>
-              <w:t>2-3</w:t>
+              <w:t>3</w:t>
             </w:r>
           </w:p>
           <w:p>

</xml_diff>